<commit_message>
Added additional questions to first orders_judgments object in SA pathway; edited cc 395 attachment to reflect new info
</commit_message>
<xml_diff>
--- a/docassemble/MLHPPOAndProposedOrder/data/templates/cc_395_attachment.docx
+++ b/docassemble/MLHPPOAndProposedOrder/data/templates/cc_395_attachment.docx
@@ -733,19 +733,77 @@
     </w:p>
     <w:p>
       <w:pPr>
-        <w:rPr>
-          <w:rFonts w:ascii="Arial" w:hAnsi="Arial" w:cs="Arial"/>
-          <w:sz w:val="22"/>
-          <w:szCs w:val="22"/>
-        </w:rPr>
-      </w:pPr>
-      <w:r>
-        <w:rPr>
-          <w:rFonts w:ascii="Arial" w:hAnsi="Arial" w:cs="Arial"/>
-          <w:sz w:val="22"/>
-          <w:szCs w:val="22"/>
-        </w:rPr>
-        <w:tab/>
+        <w:ind w:left="720"/>
+        <w:rPr>
+          <w:rFonts w:ascii="Arial" w:hAnsi="Arial" w:cs="Arial"/>
+          <w:sz w:val="22"/>
+          <w:szCs w:val="22"/>
+        </w:rPr>
+      </w:pPr>
+      <w:r>
+        <w:rPr>
+          <w:rFonts w:ascii="Arial" w:hAnsi="Arial" w:cs="Arial"/>
+          <w:sz w:val="22"/>
+          <w:szCs w:val="22"/>
+        </w:rPr>
+        <w:t>{%p if respondent_sexual_assault_conviction and loop.first %}</w:t>
+      </w:r>
+    </w:p>
+    <w:p>
+      <w:pPr>
+        <w:ind w:left="720"/>
+        <w:rPr>
+          <w:rFonts w:ascii="Arial" w:hAnsi="Arial" w:cs="Arial"/>
+          <w:b/>
+          <w:bCs/>
+          <w:sz w:val="22"/>
+          <w:szCs w:val="22"/>
+        </w:rPr>
+      </w:pPr>
+      <w:r>
+        <w:rPr>
+          <w:rFonts w:ascii="Arial" w:hAnsi="Arial" w:cs="Arial"/>
+          <w:b/>
+          <w:bCs/>
+          <w:sz w:val="22"/>
+          <w:szCs w:val="22"/>
+        </w:rPr>
+        <w:t>Sexual Assault Conviction</w:t>
+      </w:r>
+    </w:p>
+    <w:p>
+      <w:pPr>
+        <w:ind w:left="720"/>
+        <w:rPr>
+          <w:rFonts w:ascii="Arial" w:hAnsi="Arial" w:cs="Arial"/>
+          <w:sz w:val="22"/>
+          <w:szCs w:val="22"/>
+        </w:rPr>
+      </w:pPr>
+      <w:r>
+        <w:rPr>
+          <w:rFonts w:ascii="Arial" w:hAnsi="Arial" w:cs="Arial"/>
+          <w:sz w:val="22"/>
+          <w:szCs w:val="22"/>
+        </w:rPr>
+        <w:t>{%p endif %}</w:t>
+      </w:r>
+    </w:p>
+    <w:p>
+      <w:pPr>
+        <w:ind w:firstLine="720"/>
+        <w:rPr>
+          <w:rFonts w:ascii="Arial" w:hAnsi="Arial" w:cs="Arial"/>
+          <w:sz w:val="22"/>
+          <w:szCs w:val="22"/>
+        </w:rPr>
+      </w:pPr>
+      <w:r>
+        <w:rPr>
+          <w:rFonts w:ascii="Arial" w:hAnsi="Arial" w:cs="Arial"/>
+          <w:sz w:val="22"/>
+          <w:szCs w:val="22"/>
+        </w:rPr>
         <w:t>Case number: {{ order.docket_number }}</w:t>
       </w:r>
     </w:p>
@@ -800,6 +858,7 @@
           <w:sz w:val="22"/>
           <w:szCs w:val="22"/>
         </w:rPr>
+        <w:lastRenderedPageBreak/>
         <w:t>{%p else %}</w:t>
       </w:r>
     </w:p>
@@ -854,7 +913,6 @@
           <w:sz w:val="22"/>
           <w:szCs w:val="22"/>
         </w:rPr>
-        <w:lastRenderedPageBreak/>
         <w:t>{%p if order.court_county %}</w:t>
       </w:r>
     </w:p>
@@ -1090,6 +1148,168 @@
           <w:szCs w:val="22"/>
         </w:rPr>
         <w:t>Name of judge:____________________________________________________</w:t>
+      </w:r>
+    </w:p>
+    <w:p>
+      <w:pPr>
+        <w:ind w:left="720"/>
+        <w:rPr>
+          <w:rFonts w:ascii="Arial" w:hAnsi="Arial" w:cs="Arial"/>
+          <w:sz w:val="22"/>
+          <w:szCs w:val="22"/>
+        </w:rPr>
+      </w:pPr>
+      <w:r>
+        <w:rPr>
+          <w:rFonts w:ascii="Arial" w:hAnsi="Arial" w:cs="Arial"/>
+          <w:sz w:val="22"/>
+          <w:szCs w:val="22"/>
+        </w:rPr>
+        <w:t>{%p endif %}</w:t>
+      </w:r>
+    </w:p>
+    <w:p>
+      <w:pPr>
+        <w:ind w:left="720"/>
+        <w:rPr>
+          <w:rFonts w:ascii="Arial" w:hAnsi="Arial" w:cs="Arial"/>
+          <w:sz w:val="22"/>
+          <w:szCs w:val="22"/>
+        </w:rPr>
+      </w:pPr>
+      <w:r>
+        <w:rPr>
+          <w:rFonts w:ascii="Arial" w:hAnsi="Arial" w:cs="Arial"/>
+          <w:sz w:val="22"/>
+          <w:szCs w:val="22"/>
+        </w:rPr>
+        <w:t>{%p if respondent_sexual_assault_conviction and loop.first %}</w:t>
+      </w:r>
+    </w:p>
+    <w:p>
+      <w:pPr>
+        <w:ind w:left="720"/>
+        <w:rPr>
+          <w:rFonts w:ascii="Arial" w:hAnsi="Arial" w:cs="Arial"/>
+          <w:sz w:val="22"/>
+          <w:szCs w:val="22"/>
+        </w:rPr>
+      </w:pPr>
+      <w:r>
+        <w:rPr>
+          <w:rFonts w:ascii="Arial" w:hAnsi="Arial" w:cs="Arial"/>
+          <w:sz w:val="22"/>
+          <w:szCs w:val="22"/>
+        </w:rPr>
+        <w:t>{%p if order.incident_multiple_dates %}</w:t>
+      </w:r>
+    </w:p>
+    <w:p>
+      <w:pPr>
+        <w:ind w:left="720"/>
+        <w:rPr>
+          <w:rFonts w:ascii="Arial" w:hAnsi="Arial" w:cs="Arial"/>
+          <w:sz w:val="22"/>
+          <w:szCs w:val="22"/>
+        </w:rPr>
+      </w:pPr>
+      <w:r>
+        <w:rPr>
+          <w:rFonts w:ascii="Arial" w:hAnsi="Arial" w:cs="Arial"/>
+          <w:sz w:val="22"/>
+          <w:szCs w:val="22"/>
+        </w:rPr>
+        <w:t>Incident(s) start date: {{ order.incident_start_date }}</w:t>
+      </w:r>
+    </w:p>
+    <w:p>
+      <w:pPr>
+        <w:ind w:left="720"/>
+        <w:rPr>
+          <w:rFonts w:ascii="Arial" w:hAnsi="Arial" w:cs="Arial"/>
+          <w:sz w:val="22"/>
+          <w:szCs w:val="22"/>
+        </w:rPr>
+      </w:pPr>
+      <w:r>
+        <w:rPr>
+          <w:rFonts w:ascii="Arial" w:hAnsi="Arial" w:cs="Arial"/>
+          <w:sz w:val="22"/>
+          <w:szCs w:val="22"/>
+        </w:rPr>
+        <w:t>Incident(s) end date: {{ order.incident_end_date }}</w:t>
+      </w:r>
+    </w:p>
+    <w:p>
+      <w:pPr>
+        <w:ind w:left="720"/>
+        <w:rPr>
+          <w:rFonts w:ascii="Arial" w:hAnsi="Arial" w:cs="Arial"/>
+          <w:sz w:val="22"/>
+          <w:szCs w:val="22"/>
+        </w:rPr>
+      </w:pPr>
+      <w:r>
+        <w:rPr>
+          <w:rFonts w:ascii="Arial" w:hAnsi="Arial" w:cs="Arial"/>
+          <w:sz w:val="22"/>
+          <w:szCs w:val="22"/>
+        </w:rPr>
+        <w:t>{%p else %}</w:t>
+      </w:r>
+    </w:p>
+    <w:p>
+      <w:pPr>
+        <w:ind w:left="720"/>
+        <w:rPr>
+          <w:rFonts w:ascii="Arial" w:hAnsi="Arial" w:cs="Arial"/>
+          <w:sz w:val="22"/>
+          <w:szCs w:val="22"/>
+        </w:rPr>
+      </w:pPr>
+      <w:r>
+        <w:rPr>
+          <w:rFonts w:ascii="Arial" w:hAnsi="Arial" w:cs="Arial"/>
+          <w:sz w:val="22"/>
+          <w:szCs w:val="22"/>
+        </w:rPr>
+        <w:t>Incident date: {{ order.incident_start_date }}</w:t>
+      </w:r>
+    </w:p>
+    <w:p>
+      <w:pPr>
+        <w:ind w:left="720"/>
+        <w:rPr>
+          <w:rFonts w:ascii="Arial" w:hAnsi="Arial" w:cs="Arial"/>
+          <w:sz w:val="22"/>
+          <w:szCs w:val="22"/>
+        </w:rPr>
+      </w:pPr>
+      <w:r>
+        <w:rPr>
+          <w:rFonts w:ascii="Arial" w:hAnsi="Arial" w:cs="Arial"/>
+          <w:sz w:val="22"/>
+          <w:szCs w:val="22"/>
+        </w:rPr>
+        <w:t>{%p endif %}</w:t>
+      </w:r>
+    </w:p>
+    <w:p>
+      <w:pPr>
+        <w:ind w:left="720"/>
+        <w:rPr>
+          <w:rFonts w:ascii="Arial" w:hAnsi="Arial" w:cs="Arial"/>
+          <w:sz w:val="22"/>
+          <w:szCs w:val="22"/>
+        </w:rPr>
+      </w:pPr>
+      <w:r>
+        <w:rPr>
+          <w:rFonts w:ascii="Arial" w:hAnsi="Arial" w:cs="Arial"/>
+          <w:sz w:val="22"/>
+          <w:szCs w:val="22"/>
+        </w:rPr>
+        <w:t>Incident description: {{ order.incident_description }}</w:t>
       </w:r>
     </w:p>
     <w:p>
@@ -1303,7 +1523,6 @@
           <w:szCs w:val="22"/>
         </w:rPr>
       </w:pPr>
-      <w:proofErr w:type="gramStart"/>
       <w:r>
         <w:rPr>
           <w:rFonts w:ascii="Arial" w:hAnsi="Arial" w:cs="Arial"/>
@@ -1318,42 +1537,15 @@
           <w:sz w:val="22"/>
           <w:szCs w:val="22"/>
         </w:rPr>
-        <w:t>item</w:t>
-      </w:r>
-      <w:proofErr w:type="gramEnd"/>
-      <w:r>
-        <w:rPr>
-          <w:rFonts w:ascii="Arial" w:hAnsi="Arial" w:cs="Arial"/>
-          <w:sz w:val="22"/>
-          <w:szCs w:val="22"/>
-        </w:rPr>
-        <w:t>.on_one_</w:t>
-      </w:r>
-      <w:proofErr w:type="gramStart"/>
-      <w:r>
-        <w:rPr>
-          <w:rFonts w:ascii="Arial" w:hAnsi="Arial" w:cs="Arial"/>
-          <w:sz w:val="22"/>
-          <w:szCs w:val="22"/>
-        </w:rPr>
-        <w:t>line()</w:t>
-      </w:r>
-      <w:r>
-        <w:rPr>
-          <w:rFonts w:ascii="Arial" w:hAnsi="Arial" w:cs="Arial"/>
-          <w:sz w:val="22"/>
-          <w:szCs w:val="22"/>
-        </w:rPr>
-        <w:t xml:space="preserve"> }</w:t>
-      </w:r>
-      <w:proofErr w:type="gramEnd"/>
-      <w:r>
-        <w:rPr>
-          <w:rFonts w:ascii="Arial" w:hAnsi="Arial" w:cs="Arial"/>
-          <w:sz w:val="22"/>
-          <w:szCs w:val="22"/>
-        </w:rPr>
-        <w:t>}</w:t>
+        <w:t>item.on_one_line()</w:t>
+      </w:r>
+      <w:r>
+        <w:rPr>
+          <w:rFonts w:ascii="Arial" w:hAnsi="Arial" w:cs="Arial"/>
+          <w:sz w:val="22"/>
+          <w:szCs w:val="22"/>
+        </w:rPr>
+        <w:t xml:space="preserve"> }}</w:t>
       </w:r>
     </w:p>
     <w:p>
@@ -1371,18 +1563,8 @@
           <w:sz w:val="22"/>
           <w:szCs w:val="22"/>
         </w:rPr>
-        <w:t xml:space="preserve">{%p </w:t>
-      </w:r>
-      <w:proofErr w:type="gramStart"/>
-      <w:r>
-        <w:rPr>
-          <w:rFonts w:ascii="Arial" w:hAnsi="Arial" w:cs="Arial"/>
-          <w:sz w:val="22"/>
-          <w:szCs w:val="22"/>
-        </w:rPr>
-        <w:t>endfor %}</w:t>
-      </w:r>
-      <w:proofErr w:type="gramEnd"/>
+        <w:t>{%p endfor %}</w:t>
+      </w:r>
     </w:p>
     <w:p>
       <w:pPr>
@@ -1408,18 +1590,8 @@
           <w:sz w:val="22"/>
           <w:szCs w:val="22"/>
         </w:rPr>
-        <w:t xml:space="preserve">{%p </w:t>
-      </w:r>
-      <w:proofErr w:type="gramStart"/>
-      <w:r>
-        <w:rPr>
-          <w:rFonts w:ascii="Arial" w:hAnsi="Arial" w:cs="Arial"/>
-          <w:sz w:val="22"/>
-          <w:szCs w:val="22"/>
-        </w:rPr>
-        <w:t>endif %}</w:t>
-      </w:r>
-      <w:proofErr w:type="gramEnd"/>
+        <w:t>{%p endif %}</w:t>
+      </w:r>
     </w:p>
     <w:p>
       <w:pPr>
@@ -1618,6 +1790,7 @@
           <w:sz w:val="22"/>
           <w:szCs w:val="22"/>
         </w:rPr>
+        <w:lastRenderedPageBreak/>
         <w:t>{%p endif %}</w:t>
       </w:r>
     </w:p>

</xml_diff>

<commit_message>
incorporate language requested in #545, add petition tags per #546; add info to review screen; minor changes
</commit_message>
<xml_diff>
--- a/docassemble/MLHPPOAndProposedOrder/data/templates/cc_395_attachment.docx
+++ b/docassemble/MLHPPOAndProposedOrder/data/templates/cc_395_attachment.docx
@@ -1201,115 +1201,93 @@
           <w:sz w:val="22"/>
           <w:szCs w:val="22"/>
         </w:rPr>
-        <w:t>{%p if order.incident_multiple_dates %}</w:t>
-      </w:r>
-    </w:p>
-    <w:p>
-      <w:pPr>
-        <w:ind w:left="720"/>
-        <w:rPr>
-          <w:rFonts w:ascii="Arial" w:hAnsi="Arial" w:cs="Arial"/>
-          <w:sz w:val="22"/>
-          <w:szCs w:val="22"/>
-        </w:rPr>
-      </w:pPr>
-      <w:r>
-        <w:rPr>
-          <w:rFonts w:ascii="Arial" w:hAnsi="Arial" w:cs="Arial"/>
-          <w:sz w:val="22"/>
-          <w:szCs w:val="22"/>
-        </w:rPr>
-        <w:t>Incident(s) start date: {{ order.incident_start_date }}</w:t>
-      </w:r>
-    </w:p>
-    <w:p>
-      <w:pPr>
-        <w:ind w:left="720"/>
-        <w:rPr>
-          <w:rFonts w:ascii="Arial" w:hAnsi="Arial" w:cs="Arial"/>
-          <w:sz w:val="22"/>
-          <w:szCs w:val="22"/>
-        </w:rPr>
-      </w:pPr>
-      <w:r>
-        <w:rPr>
-          <w:rFonts w:ascii="Arial" w:hAnsi="Arial" w:cs="Arial"/>
-          <w:sz w:val="22"/>
-          <w:szCs w:val="22"/>
-        </w:rPr>
-        <w:t>Incident(s) end date: {{ order.incident_end_date }}</w:t>
-      </w:r>
-    </w:p>
-    <w:p>
-      <w:pPr>
-        <w:ind w:left="720"/>
-        <w:rPr>
-          <w:rFonts w:ascii="Arial" w:hAnsi="Arial" w:cs="Arial"/>
-          <w:sz w:val="22"/>
-          <w:szCs w:val="22"/>
-        </w:rPr>
-      </w:pPr>
-      <w:r>
-        <w:rPr>
-          <w:rFonts w:ascii="Arial" w:hAnsi="Arial" w:cs="Arial"/>
-          <w:sz w:val="22"/>
-          <w:szCs w:val="22"/>
-        </w:rPr>
-        <w:t>{%p else %}</w:t>
-      </w:r>
-    </w:p>
-    <w:p>
-      <w:pPr>
-        <w:ind w:left="720"/>
-        <w:rPr>
-          <w:rFonts w:ascii="Arial" w:hAnsi="Arial" w:cs="Arial"/>
-          <w:sz w:val="22"/>
-          <w:szCs w:val="22"/>
-        </w:rPr>
-      </w:pPr>
-      <w:r>
-        <w:rPr>
-          <w:rFonts w:ascii="Arial" w:hAnsi="Arial" w:cs="Arial"/>
-          <w:sz w:val="22"/>
-          <w:szCs w:val="22"/>
-        </w:rPr>
-        <w:t>Incident date: {{ order.incident_start_date }}</w:t>
-      </w:r>
-    </w:p>
-    <w:p>
-      <w:pPr>
-        <w:ind w:left="720"/>
-        <w:rPr>
-          <w:rFonts w:ascii="Arial" w:hAnsi="Arial" w:cs="Arial"/>
-          <w:sz w:val="22"/>
-          <w:szCs w:val="22"/>
-        </w:rPr>
-      </w:pPr>
-      <w:r>
-        <w:rPr>
-          <w:rFonts w:ascii="Arial" w:hAnsi="Arial" w:cs="Arial"/>
-          <w:sz w:val="22"/>
-          <w:szCs w:val="22"/>
-        </w:rPr>
-        <w:t>{%p endif %}</w:t>
-      </w:r>
-    </w:p>
-    <w:p>
-      <w:pPr>
-        <w:ind w:left="720"/>
-        <w:rPr>
-          <w:rFonts w:ascii="Arial" w:hAnsi="Arial" w:cs="Arial"/>
-          <w:sz w:val="22"/>
-          <w:szCs w:val="22"/>
-        </w:rPr>
-      </w:pPr>
-      <w:r>
-        <w:rPr>
-          <w:rFonts w:ascii="Arial" w:hAnsi="Arial" w:cs="Arial"/>
-          <w:sz w:val="22"/>
-          <w:szCs w:val="22"/>
-        </w:rPr>
-        <w:t>Incident description: {{ order.incident_description }}</w:t>
+        <w:t>D</w:t>
+      </w:r>
+      <w:r>
+        <w:rPr>
+          <w:rFonts w:ascii="Arial" w:hAnsi="Arial" w:cs="Arial"/>
+          <w:sz w:val="22"/>
+          <w:szCs w:val="22"/>
+        </w:rPr>
+        <w:t>escription</w:t>
+      </w:r>
+      <w:r>
+        <w:rPr>
+          <w:rFonts w:ascii="Arial" w:hAnsi="Arial" w:cs="Arial"/>
+          <w:sz w:val="22"/>
+          <w:szCs w:val="22"/>
+        </w:rPr>
+        <w:t xml:space="preserve"> of underlying facts</w:t>
+      </w:r>
+      <w:r>
+        <w:rPr>
+          <w:rFonts w:ascii="Arial" w:hAnsi="Arial" w:cs="Arial"/>
+          <w:sz w:val="22"/>
+          <w:szCs w:val="22"/>
+        </w:rPr>
+        <w:t xml:space="preserve">: {{ </w:t>
+      </w:r>
+      <w:proofErr w:type="spellStart"/>
+      <w:r>
+        <w:rPr>
+          <w:rFonts w:ascii="Arial" w:hAnsi="Arial" w:cs="Arial"/>
+          <w:sz w:val="22"/>
+          <w:szCs w:val="22"/>
+        </w:rPr>
+        <w:t>order.incident_description</w:t>
+      </w:r>
+      <w:proofErr w:type="spellEnd"/>
+      <w:r>
+        <w:rPr>
+          <w:rFonts w:ascii="Arial" w:hAnsi="Arial" w:cs="Arial"/>
+          <w:sz w:val="22"/>
+          <w:szCs w:val="22"/>
+        </w:rPr>
+        <w:t xml:space="preserve"> }}</w:t>
+      </w:r>
+    </w:p>
+    <w:p>
+      <w:pPr>
+        <w:ind w:left="720"/>
+        <w:rPr>
+          <w:rFonts w:ascii="Arial" w:hAnsi="Arial" w:cs="Arial"/>
+          <w:sz w:val="22"/>
+          <w:szCs w:val="22"/>
+        </w:rPr>
+      </w:pPr>
+      <w:r>
+        <w:rPr>
+          <w:rFonts w:ascii="Arial" w:hAnsi="Arial" w:cs="Arial"/>
+          <w:sz w:val="22"/>
+          <w:szCs w:val="22"/>
+        </w:rPr>
+        <w:t xml:space="preserve">Additional actions by Respondent that cause Petitioner to fear for their safety: {{ </w:t>
+      </w:r>
+      <w:proofErr w:type="spellStart"/>
+      <w:r>
+        <w:rPr>
+          <w:rFonts w:ascii="Arial" w:hAnsi="Arial" w:cs="Arial"/>
+          <w:sz w:val="22"/>
+          <w:szCs w:val="22"/>
+        </w:rPr>
+        <w:t>order.</w:t>
+      </w:r>
+      <w:r>
+        <w:rPr>
+          <w:rFonts w:ascii="Arial" w:hAnsi="Arial" w:cs="Arial"/>
+          <w:sz w:val="22"/>
+          <w:szCs w:val="22"/>
+        </w:rPr>
+        <w:t>additional_factors</w:t>
+      </w:r>
+      <w:proofErr w:type="spellEnd"/>
+      <w:r>
+        <w:rPr>
+          <w:rFonts w:ascii="Arial" w:hAnsi="Arial" w:cs="Arial"/>
+          <w:sz w:val="22"/>
+          <w:szCs w:val="22"/>
+        </w:rPr>
+        <w:t xml:space="preserve"> }}</w:t>
       </w:r>
     </w:p>
     <w:p>
@@ -1790,7 +1768,6 @@
           <w:sz w:val="22"/>
           <w:szCs w:val="22"/>
         </w:rPr>
-        <w:lastRenderedPageBreak/>
         <w:t>{%p endif %}</w:t>
       </w:r>
     </w:p>
@@ -1909,6 +1886,7 @@
           <w:sz w:val="22"/>
           <w:szCs w:val="22"/>
         </w:rPr>
+        <w:lastRenderedPageBreak/>
         <w:t xml:space="preserve">{{ </w:t>
       </w:r>
       <w:r>

</xml_diff>